<commit_message>
docs: link do codigo na introducao e na conclusao do Projeto Integrador
O endereco do repositorio passa a aparecer tambem na introducao e na conclusao,
e as tres ocorrencias viram link clicavel.

Co-Authored-By: Claude Opus 5.5 <noreply@anthropic.com>
Claude-Session: https://claude.ai/code/session_011SKCdnRmci1yJCi4ZvMpS2
</commit_message>
<xml_diff>
--- a/docs/Projeto-Integrador.docx
+++ b/docs/Projeto-Integrador.docx
@@ -602,7 +602,7 @@
             </w:rPr>
             <w:fldChar w:fldCharType="separate"/>
           </w:r>
-          <w:hyperlink w:anchor="__RefHeading___Toc500_4209293148">
+          <w:hyperlink w:anchor="__RefHeading___Toc510_2577897446">
             <w:r>
               <w:rPr>
                 <w:webHidden/>
@@ -623,7 +623,7 @@
             </w:tabs>
             <w:rPr/>
           </w:pPr>
-          <w:hyperlink w:anchor="__RefHeading___Toc502_4209293148">
+          <w:hyperlink w:anchor="__RefHeading___Toc512_2577897446">
             <w:r>
               <w:rPr>
                 <w:webHidden/>
@@ -644,7 +644,7 @@
             </w:tabs>
             <w:rPr/>
           </w:pPr>
-          <w:hyperlink w:anchor="__RefHeading___Toc504_4209293148">
+          <w:hyperlink w:anchor="__RefHeading___Toc514_2577897446">
             <w:r>
               <w:rPr>
                 <w:webHidden/>
@@ -665,7 +665,7 @@
             </w:tabs>
             <w:rPr/>
           </w:pPr>
-          <w:hyperlink w:anchor="__RefHeading___Toc506_4209293148">
+          <w:hyperlink w:anchor="__RefHeading___Toc516_2577897446">
             <w:r>
               <w:rPr>
                 <w:webHidden/>
@@ -686,7 +686,7 @@
             </w:tabs>
             <w:rPr/>
           </w:pPr>
-          <w:hyperlink w:anchor="__RefHeading___Toc508_4209293148">
+          <w:hyperlink w:anchor="__RefHeading___Toc518_2577897446">
             <w:r>
               <w:rPr>
                 <w:webHidden/>
@@ -714,7 +714,7 @@
             </w:tabs>
             <w:rPr/>
           </w:pPr>
-          <w:hyperlink w:anchor="__RefHeading___Toc510_4209293148">
+          <w:hyperlink w:anchor="__RefHeading___Toc520_2577897446">
             <w:r>
               <w:rPr>
                 <w:webHidden/>
@@ -742,7 +742,7 @@
             </w:tabs>
             <w:rPr/>
           </w:pPr>
-          <w:hyperlink w:anchor="__RefHeading___Toc512_4209293148">
+          <w:hyperlink w:anchor="__RefHeading___Toc522_2577897446">
             <w:r>
               <w:rPr>
                 <w:webHidden/>
@@ -763,7 +763,7 @@
             </w:tabs>
             <w:rPr/>
           </w:pPr>
-          <w:hyperlink w:anchor="__RefHeading___Toc514_4209293148">
+          <w:hyperlink w:anchor="__RefHeading___Toc524_2577897446">
             <w:r>
               <w:rPr>
                 <w:webHidden/>
@@ -784,7 +784,7 @@
             </w:tabs>
             <w:rPr/>
           </w:pPr>
-          <w:hyperlink w:anchor="__RefHeading___Toc516_4209293148">
+          <w:hyperlink w:anchor="__RefHeading___Toc526_2577897446">
             <w:r>
               <w:rPr>
                 <w:webHidden/>
@@ -805,7 +805,7 @@
             </w:tabs>
             <w:rPr/>
           </w:pPr>
-          <w:hyperlink w:anchor="__RefHeading___Toc518_4209293148">
+          <w:hyperlink w:anchor="__RefHeading___Toc528_2577897446">
             <w:r>
               <w:rPr>
                 <w:webHidden/>
@@ -826,7 +826,7 @@
             </w:tabs>
             <w:rPr/>
           </w:pPr>
-          <w:hyperlink w:anchor="__RefHeading___Toc520_4209293148">
+          <w:hyperlink w:anchor="__RefHeading___Toc530_2577897446">
             <w:r>
               <w:rPr>
                 <w:webHidden/>
@@ -847,7 +847,7 @@
             </w:tabs>
             <w:rPr/>
           </w:pPr>
-          <w:hyperlink w:anchor="__RefHeading___Toc522_4209293148">
+          <w:hyperlink w:anchor="__RefHeading___Toc532_2577897446">
             <w:r>
               <w:rPr>
                 <w:webHidden/>
@@ -868,7 +868,7 @@
             </w:tabs>
             <w:rPr/>
           </w:pPr>
-          <w:hyperlink w:anchor="__RefHeading___Toc524_4209293148">
+          <w:hyperlink w:anchor="__RefHeading___Toc534_2577897446">
             <w:r>
               <w:rPr>
                 <w:webHidden/>
@@ -889,7 +889,7 @@
             </w:tabs>
             <w:rPr/>
           </w:pPr>
-          <w:hyperlink w:anchor="__RefHeading___Toc526_4209293148">
+          <w:hyperlink w:anchor="__RefHeading___Toc536_2577897446">
             <w:r>
               <w:rPr>
                 <w:webHidden/>
@@ -910,7 +910,7 @@
             </w:tabs>
             <w:rPr/>
           </w:pPr>
-          <w:hyperlink w:anchor="__RefHeading___Toc528_4209293148">
+          <w:hyperlink w:anchor="__RefHeading___Toc538_2577897446">
             <w:r>
               <w:rPr>
                 <w:webHidden/>
@@ -931,7 +931,7 @@
             </w:tabs>
             <w:rPr/>
           </w:pPr>
-          <w:hyperlink w:anchor="__RefHeading___Toc530_4209293148">
+          <w:hyperlink w:anchor="__RefHeading___Toc540_2577897446">
             <w:r>
               <w:rPr>
                 <w:webHidden/>
@@ -952,7 +952,7 @@
             </w:tabs>
             <w:rPr/>
           </w:pPr>
-          <w:hyperlink w:anchor="__RefHeading___Toc532_4209293148">
+          <w:hyperlink w:anchor="__RefHeading___Toc542_2577897446">
             <w:r>
               <w:rPr>
                 <w:webHidden/>
@@ -973,7 +973,7 @@
             </w:tabs>
             <w:rPr/>
           </w:pPr>
-          <w:hyperlink w:anchor="__RefHeading___Toc534_4209293148">
+          <w:hyperlink w:anchor="__RefHeading___Toc544_2577897446">
             <w:r>
               <w:rPr>
                 <w:webHidden/>
@@ -994,7 +994,7 @@
             </w:tabs>
             <w:rPr/>
           </w:pPr>
-          <w:hyperlink w:anchor="__RefHeading___Toc536_4209293148">
+          <w:hyperlink w:anchor="__RefHeading___Toc546_2577897446">
             <w:r>
               <w:rPr>
                 <w:webHidden/>
@@ -1015,7 +1015,7 @@
             </w:tabs>
             <w:rPr/>
           </w:pPr>
-          <w:hyperlink w:anchor="__RefHeading___Toc538_4209293148">
+          <w:hyperlink w:anchor="__RefHeading___Toc548_2577897446">
             <w:r>
               <w:rPr>
                 <w:webHidden/>
@@ -1036,7 +1036,7 @@
             </w:tabs>
             <w:rPr/>
           </w:pPr>
-          <w:hyperlink w:anchor="__RefHeading___Toc540_4209293148">
+          <w:hyperlink w:anchor="__RefHeading___Toc550_2577897446">
             <w:r>
               <w:rPr>
                 <w:webHidden/>
@@ -1057,7 +1057,7 @@
             </w:tabs>
             <w:rPr/>
           </w:pPr>
-          <w:hyperlink w:anchor="__RefHeading___Toc542_4209293148">
+          <w:hyperlink w:anchor="__RefHeading___Toc552_2577897446">
             <w:r>
               <w:rPr>
                 <w:webHidden/>
@@ -1078,7 +1078,7 @@
             </w:tabs>
             <w:rPr/>
           </w:pPr>
-          <w:hyperlink w:anchor="__RefHeading___Toc544_4209293148">
+          <w:hyperlink w:anchor="__RefHeading___Toc554_2577897446">
             <w:r>
               <w:rPr>
                 <w:webHidden/>
@@ -1099,7 +1099,7 @@
             </w:tabs>
             <w:rPr/>
           </w:pPr>
-          <w:hyperlink w:anchor="__RefHeading___Toc546_4209293148">
+          <w:hyperlink w:anchor="__RefHeading___Toc556_2577897446">
             <w:r>
               <w:rPr>
                 <w:webHidden/>
@@ -1120,7 +1120,7 @@
             </w:tabs>
             <w:rPr/>
           </w:pPr>
-          <w:hyperlink w:anchor="__RefHeading___Toc548_4209293148">
+          <w:hyperlink w:anchor="__RefHeading___Toc558_2577897446">
             <w:r>
               <w:rPr>
                 <w:webHidden/>
@@ -1141,7 +1141,7 @@
             </w:tabs>
             <w:rPr/>
           </w:pPr>
-          <w:hyperlink w:anchor="__RefHeading___Toc550_4209293148">
+          <w:hyperlink w:anchor="__RefHeading___Toc560_2577897446">
             <w:r>
               <w:rPr>
                 <w:webHidden/>
@@ -1162,7 +1162,7 @@
             </w:tabs>
             <w:rPr/>
           </w:pPr>
-          <w:hyperlink w:anchor="__RefHeading___Toc552_4209293148">
+          <w:hyperlink w:anchor="__RefHeading___Toc562_2577897446">
             <w:r>
               <w:rPr>
                 <w:webHidden/>
@@ -1183,7 +1183,7 @@
             </w:tabs>
             <w:rPr/>
           </w:pPr>
-          <w:hyperlink w:anchor="__RefHeading___Toc554_4209293148">
+          <w:hyperlink w:anchor="__RefHeading___Toc564_2577897446">
             <w:r>
               <w:rPr>
                 <w:webHidden/>
@@ -1204,7 +1204,7 @@
             </w:tabs>
             <w:rPr/>
           </w:pPr>
-          <w:hyperlink w:anchor="__RefHeading___Toc556_4209293148">
+          <w:hyperlink w:anchor="__RefHeading___Toc566_2577897446">
             <w:r>
               <w:rPr>
                 <w:webHidden/>
@@ -1225,7 +1225,7 @@
             </w:tabs>
             <w:rPr/>
           </w:pPr>
-          <w:hyperlink w:anchor="__RefHeading___Toc558_4209293148">
+          <w:hyperlink w:anchor="__RefHeading___Toc568_2577897446">
             <w:r>
               <w:rPr>
                 <w:webHidden/>
@@ -1246,7 +1246,7 @@
             </w:tabs>
             <w:rPr/>
           </w:pPr>
-          <w:hyperlink w:anchor="__RefHeading___Toc560_4209293148">
+          <w:hyperlink w:anchor="__RefHeading___Toc570_2577897446">
             <w:r>
               <w:rPr>
                 <w:webHidden/>
@@ -1287,7 +1287,7 @@
         <w:jc w:val="left"/>
         <w:rPr/>
       </w:pPr>
-      <w:bookmarkStart w:id="0" w:name="__RefHeading___Toc500_4209293148"/>
+      <w:bookmarkStart w:id="0" w:name="__RefHeading___Toc510_2577897446"/>
       <w:bookmarkEnd w:id="0"/>
       <w:r>
         <w:rPr>
@@ -1331,7 +1331,26 @@
           <w:sz w:val="24"/>
           <w:szCs w:val="24"/>
         </w:rPr>
-        <w:t>Diante desse cenário, este trabalho propõe o Gerenciador de Eventos Acadêmicos, uma aplicação web que reúne em uma única plataforma o cadastro e a publicação de eventos, a inscrição com controle de vagas e fila de espera, o registro de presença, a emissão de certificados com código de autenticidade e a coleta de avaliações. Para reduzir o esforço de cadastro, o sistema emprega inteligência artificial na extração dos dados do evento a partir de um texto livre, mantendo o organizador como responsável pela revisão final.</w:t>
+        <w:t xml:space="preserve">Diante desse cenário, este trabalho propõe o Gerenciador de Eventos Acadêmicos, uma aplicação web que reúne em uma única plataforma o cadastro e a publicação de eventos, a inscrição com controle de vagas e fila de espera, o registro de presença, a emissão de certificados com código de autenticidade e a coleta de avaliações. Para reduzir o esforço de cadastro, o sistema emprega inteligência artificial na extração dos dados do evento a partir de um texto livre, mantendo o organizador como responsável pela revisão final. O código-fonte do sistema está disponível no repositório </w:t>
+      </w:r>
+      <w:hyperlink r:id="rId3">
+        <w:r>
+          <w:rPr>
+            <w:rStyle w:val="ListLabel10"/>
+            <w:rFonts w:eastAsia="Arial" w:cs="Arial"/>
+            <w:sz w:val="24"/>
+            <w:szCs w:val="24"/>
+          </w:rPr>
+          <w:t>https://github.com/Jayzmatos22/GerenciadorDeEventos</w:t>
+        </w:r>
+      </w:hyperlink>
+      <w:r>
+        <w:rPr>
+          <w:rFonts w:eastAsia="Arial" w:cs="Arial"/>
+          <w:sz w:val="24"/>
+          <w:szCs w:val="24"/>
+        </w:rPr>
+        <w:t>.</w:t>
       </w:r>
     </w:p>
     <w:p>
@@ -1359,7 +1378,7 @@
         <w:jc w:val="left"/>
         <w:rPr/>
       </w:pPr>
-      <w:bookmarkStart w:id="1" w:name="__RefHeading___Toc502_4209293148"/>
+      <w:bookmarkStart w:id="1" w:name="__RefHeading___Toc512_2577897446"/>
       <w:bookmarkEnd w:id="1"/>
       <w:r>
         <w:rPr>
@@ -1414,7 +1433,7 @@
         <w:jc w:val="left"/>
         <w:rPr/>
       </w:pPr>
-      <w:bookmarkStart w:id="2" w:name="__RefHeading___Toc504_4209293148"/>
+      <w:bookmarkStart w:id="2" w:name="__RefHeading___Toc514_2577897446"/>
       <w:bookmarkEnd w:id="2"/>
       <w:r>
         <w:rPr>
@@ -1452,7 +1471,7 @@
         <w:jc w:val="left"/>
         <w:rPr/>
       </w:pPr>
-      <w:bookmarkStart w:id="3" w:name="__RefHeading___Toc506_4209293148"/>
+      <w:bookmarkStart w:id="3" w:name="__RefHeading___Toc516_2577897446"/>
       <w:bookmarkEnd w:id="3"/>
       <w:r>
         <w:rPr>
@@ -1473,7 +1492,7 @@
         <w:jc w:val="left"/>
         <w:rPr/>
       </w:pPr>
-      <w:bookmarkStart w:id="4" w:name="__RefHeading___Toc508_4209293148"/>
+      <w:bookmarkStart w:id="4" w:name="__RefHeading___Toc518_2577897446"/>
       <w:bookmarkEnd w:id="4"/>
       <w:r>
         <w:rPr>
@@ -1513,7 +1532,7 @@
         <w:jc w:val="left"/>
         <w:rPr/>
       </w:pPr>
-      <w:bookmarkStart w:id="5" w:name="__RefHeading___Toc510_4209293148"/>
+      <w:bookmarkStart w:id="5" w:name="__RefHeading___Toc520_2577897446"/>
       <w:bookmarkEnd w:id="5"/>
       <w:r>
         <w:rPr>
@@ -1655,7 +1674,7 @@
         <w:jc w:val="left"/>
         <w:rPr/>
       </w:pPr>
-      <w:bookmarkStart w:id="6" w:name="__RefHeading___Toc512_4209293148"/>
+      <w:bookmarkStart w:id="6" w:name="__RefHeading___Toc522_2577897446"/>
       <w:bookmarkEnd w:id="6"/>
       <w:r>
         <w:rPr>
@@ -1713,7 +1732,7 @@
         <w:jc w:val="left"/>
         <w:rPr/>
       </w:pPr>
-      <w:bookmarkStart w:id="7" w:name="__RefHeading___Toc514_4209293148"/>
+      <w:bookmarkStart w:id="7" w:name="__RefHeading___Toc524_2577897446"/>
       <w:bookmarkEnd w:id="7"/>
       <w:r>
         <w:rPr>
@@ -1751,7 +1770,7 @@
         <w:jc w:val="left"/>
         <w:rPr/>
       </w:pPr>
-      <w:bookmarkStart w:id="8" w:name="__RefHeading___Toc516_4209293148"/>
+      <w:bookmarkStart w:id="8" w:name="__RefHeading___Toc526_2577897446"/>
       <w:bookmarkEnd w:id="8"/>
       <w:r>
         <w:rPr>
@@ -1806,7 +1825,7 @@
         <w:jc w:val="left"/>
         <w:rPr/>
       </w:pPr>
-      <w:bookmarkStart w:id="9" w:name="__RefHeading___Toc518_4209293148"/>
+      <w:bookmarkStart w:id="9" w:name="__RefHeading___Toc528_2577897446"/>
       <w:bookmarkEnd w:id="9"/>
       <w:r>
         <w:rPr>
@@ -1844,7 +1863,7 @@
         <w:jc w:val="left"/>
         <w:rPr/>
       </w:pPr>
-      <w:bookmarkStart w:id="10" w:name="__RefHeading___Toc520_4209293148"/>
+      <w:bookmarkStart w:id="10" w:name="__RefHeading___Toc530_2577897446"/>
       <w:bookmarkEnd w:id="10"/>
       <w:r>
         <w:rPr>
@@ -1882,7 +1901,7 @@
         <w:jc w:val="left"/>
         <w:rPr/>
       </w:pPr>
-      <w:bookmarkStart w:id="11" w:name="__RefHeading___Toc522_4209293148"/>
+      <w:bookmarkStart w:id="11" w:name="__RefHeading___Toc532_2577897446"/>
       <w:bookmarkEnd w:id="11"/>
       <w:r>
         <w:rPr>
@@ -1920,7 +1939,7 @@
         <w:jc w:val="left"/>
         <w:rPr/>
       </w:pPr>
-      <w:bookmarkStart w:id="12" w:name="__RefHeading___Toc524_4209293148"/>
+      <w:bookmarkStart w:id="12" w:name="__RefHeading___Toc534_2577897446"/>
       <w:bookmarkEnd w:id="12"/>
       <w:r>
         <w:rPr>
@@ -1978,7 +1997,7 @@
         <w:jc w:val="left"/>
         <w:rPr/>
       </w:pPr>
-      <w:bookmarkStart w:id="13" w:name="__RefHeading___Toc526_4209293148"/>
+      <w:bookmarkStart w:id="13" w:name="__RefHeading___Toc536_2577897446"/>
       <w:bookmarkEnd w:id="13"/>
       <w:r>
         <w:rPr>
@@ -1999,7 +2018,7 @@
         <w:jc w:val="left"/>
         <w:rPr/>
       </w:pPr>
-      <w:bookmarkStart w:id="14" w:name="__RefHeading___Toc528_4209293148"/>
+      <w:bookmarkStart w:id="14" w:name="__RefHeading___Toc538_2577897446"/>
       <w:bookmarkEnd w:id="14"/>
       <w:r>
         <w:rPr>
@@ -2037,7 +2056,7 @@
         <w:jc w:val="left"/>
         <w:rPr/>
       </w:pPr>
-      <w:bookmarkStart w:id="15" w:name="__RefHeading___Toc530_4209293148"/>
+      <w:bookmarkStart w:id="15" w:name="__RefHeading___Toc540_2577897446"/>
       <w:bookmarkEnd w:id="15"/>
       <w:r>
         <w:rPr>
@@ -3171,7 +3190,7 @@
         <w:jc w:val="left"/>
         <w:rPr/>
       </w:pPr>
-      <w:bookmarkStart w:id="16" w:name="__RefHeading___Toc532_4209293148"/>
+      <w:bookmarkStart w:id="16" w:name="__RefHeading___Toc542_2577897446"/>
       <w:bookmarkEnd w:id="16"/>
       <w:r>
         <w:rPr>
@@ -3737,7 +3756,7 @@
         <w:jc w:val="left"/>
         <w:rPr/>
       </w:pPr>
-      <w:bookmarkStart w:id="17" w:name="__RefHeading___Toc534_4209293148"/>
+      <w:bookmarkStart w:id="17" w:name="__RefHeading___Toc544_2577897446"/>
       <w:bookmarkEnd w:id="17"/>
       <w:r>
         <w:rPr>
@@ -3792,7 +3811,7 @@
         <w:jc w:val="left"/>
         <w:rPr/>
       </w:pPr>
-      <w:bookmarkStart w:id="18" w:name="__RefHeading___Toc536_4209293148"/>
+      <w:bookmarkStart w:id="18" w:name="__RefHeading___Toc546_2577897446"/>
       <w:bookmarkEnd w:id="18"/>
       <w:r>
         <w:rPr>
@@ -3853,7 +3872,26 @@
           <w:sz w:val="24"/>
           <w:szCs w:val="24"/>
         </w:rPr>
-        <w:t>O código-fonte, a especificação técnica e os diagramas estão disponíveis no repositório do projeto: https://github.com/Jayzmatos22/GerenciadorDeEventos.</w:t>
+        <w:t xml:space="preserve">O código-fonte, a especificação técnica e os diagramas estão disponíveis no repositório do projeto: </w:t>
+      </w:r>
+      <w:hyperlink r:id="rId4">
+        <w:r>
+          <w:rPr>
+            <w:rStyle w:val="ListLabel10"/>
+            <w:rFonts w:eastAsia="Arial" w:cs="Arial"/>
+            <w:sz w:val="24"/>
+            <w:szCs w:val="24"/>
+          </w:rPr>
+          <w:t>https://github.com/Jayzmatos22/GerenciadorDeEventos</w:t>
+        </w:r>
+      </w:hyperlink>
+      <w:r>
+        <w:rPr>
+          <w:rFonts w:eastAsia="Arial" w:cs="Arial"/>
+          <w:sz w:val="24"/>
+          <w:szCs w:val="24"/>
+        </w:rPr>
+        <w:t>.</w:t>
       </w:r>
       <w:r>
         <w:br w:type="page"/>
@@ -3867,7 +3905,7 @@
         <w:jc w:val="left"/>
         <w:rPr/>
       </w:pPr>
-      <w:bookmarkStart w:id="19" w:name="__RefHeading___Toc538_4209293148"/>
+      <w:bookmarkStart w:id="19" w:name="__RefHeading___Toc548_2577897446"/>
       <w:bookmarkEnd w:id="19"/>
       <w:r>
         <w:rPr>
@@ -3888,7 +3926,7 @@
         <w:jc w:val="left"/>
         <w:rPr/>
       </w:pPr>
-      <w:bookmarkStart w:id="20" w:name="__RefHeading___Toc540_4209293148"/>
+      <w:bookmarkStart w:id="20" w:name="__RefHeading___Toc550_2577897446"/>
       <w:bookmarkEnd w:id="20"/>
       <w:r>
         <w:rPr>
@@ -5766,7 +5804,7 @@
                     </pic:cNvPicPr>
                   </pic:nvPicPr>
                   <pic:blipFill>
-                    <a:blip r:embed="rId3"/>
+                    <a:blip r:embed="rId5"/>
                     <a:stretch>
                       <a:fillRect/>
                     </a:stretch>
@@ -5811,7 +5849,7 @@
         <w:jc w:val="left"/>
         <w:rPr/>
       </w:pPr>
-      <w:bookmarkStart w:id="21" w:name="__RefHeading___Toc542_4209293148"/>
+      <w:bookmarkStart w:id="21" w:name="__RefHeading___Toc552_2577897446"/>
       <w:bookmarkEnd w:id="21"/>
       <w:r>
         <w:rPr>
@@ -5886,7 +5924,7 @@
                     </pic:cNvPicPr>
                   </pic:nvPicPr>
                   <pic:blipFill>
-                    <a:blip r:embed="rId4"/>
+                    <a:blip r:embed="rId6"/>
                     <a:stretch>
                       <a:fillRect/>
                     </a:stretch>
@@ -5948,7 +5986,7 @@
         <w:jc w:val="left"/>
         <w:rPr/>
       </w:pPr>
-      <w:bookmarkStart w:id="22" w:name="__RefHeading___Toc544_4209293148"/>
+      <w:bookmarkStart w:id="22" w:name="__RefHeading___Toc554_2577897446"/>
       <w:bookmarkEnd w:id="22"/>
       <w:r>
         <w:rPr>
@@ -6003,7 +6041,7 @@
         <w:jc w:val="left"/>
         <w:rPr/>
       </w:pPr>
-      <w:bookmarkStart w:id="23" w:name="__RefHeading___Toc546_4209293148"/>
+      <w:bookmarkStart w:id="23" w:name="__RefHeading___Toc556_2577897446"/>
       <w:bookmarkEnd w:id="23"/>
       <w:r>
         <w:rPr>
@@ -6058,7 +6096,7 @@
         <w:jc w:val="left"/>
         <w:rPr/>
       </w:pPr>
-      <w:bookmarkStart w:id="24" w:name="__RefHeading___Toc548_4209293148"/>
+      <w:bookmarkStart w:id="24" w:name="__RefHeading___Toc558_2577897446"/>
       <w:bookmarkEnd w:id="24"/>
       <w:r>
         <w:rPr>
@@ -6150,7 +6188,7 @@
                     </pic:cNvPicPr>
                   </pic:nvPicPr>
                   <pic:blipFill>
-                    <a:blip r:embed="rId5"/>
+                    <a:blip r:embed="rId7"/>
                     <a:stretch>
                       <a:fillRect/>
                     </a:stretch>
@@ -6212,7 +6250,7 @@
         <w:jc w:val="left"/>
         <w:rPr/>
       </w:pPr>
-      <w:bookmarkStart w:id="25" w:name="__RefHeading___Toc550_4209293148"/>
+      <w:bookmarkStart w:id="25" w:name="__RefHeading___Toc560_2577897446"/>
       <w:bookmarkEnd w:id="25"/>
       <w:r>
         <w:rPr>
@@ -6267,7 +6305,7 @@
         <w:jc w:val="left"/>
         <w:rPr/>
       </w:pPr>
-      <w:bookmarkStart w:id="26" w:name="__RefHeading___Toc552_4209293148"/>
+      <w:bookmarkStart w:id="26" w:name="__RefHeading___Toc562_2577897446"/>
       <w:bookmarkEnd w:id="26"/>
       <w:r>
         <w:rPr>
@@ -6342,7 +6380,7 @@
                     </pic:cNvPicPr>
                   </pic:nvPicPr>
                   <pic:blipFill>
-                    <a:blip r:embed="rId6"/>
+                    <a:blip r:embed="rId8"/>
                     <a:stretch>
                       <a:fillRect/>
                     </a:stretch>
@@ -6390,7 +6428,7 @@
                     </pic:cNvPicPr>
                   </pic:nvPicPr>
                   <pic:blipFill>
-                    <a:blip r:embed="rId7"/>
+                    <a:blip r:embed="rId9"/>
                     <a:stretch>
                       <a:fillRect/>
                     </a:stretch>
@@ -6435,7 +6473,7 @@
         <w:jc w:val="left"/>
         <w:rPr/>
       </w:pPr>
-      <w:bookmarkStart w:id="27" w:name="__RefHeading___Toc554_4209293148"/>
+      <w:bookmarkStart w:id="27" w:name="__RefHeading___Toc564_2577897446"/>
       <w:bookmarkEnd w:id="27"/>
       <w:r>
         <w:rPr>
@@ -6507,7 +6545,7 @@
         <w:jc w:val="left"/>
         <w:rPr/>
       </w:pPr>
-      <w:bookmarkStart w:id="28" w:name="__RefHeading___Toc556_4209293148"/>
+      <w:bookmarkStart w:id="28" w:name="__RefHeading___Toc566_2577897446"/>
       <w:bookmarkEnd w:id="28"/>
       <w:r>
         <w:rPr>
@@ -6565,7 +6603,7 @@
         <w:jc w:val="left"/>
         <w:rPr/>
       </w:pPr>
-      <w:bookmarkStart w:id="29" w:name="__RefHeading___Toc558_4209293148"/>
+      <w:bookmarkStart w:id="29" w:name="__RefHeading___Toc568_2577897446"/>
       <w:bookmarkEnd w:id="29"/>
       <w:r>
         <w:rPr>
@@ -6644,6 +6682,42 @@
           <w:szCs w:val="24"/>
         </w:rPr>
         <w:t>Como continuidade, sugere-se avaliar o sistema com organizadores e participantes em eventos reais, medindo o tempo de cadastro e de certificação; registrar também a saída dos participantes, para comprovar a permanência; armazenar as imagens em um serviço próprio para objetos; e incluir o envio de notificações sobre inscrições, promoções da fila e disponibilidade do certificado.</w:t>
+      </w:r>
+    </w:p>
+    <w:p>
+      <w:pPr>
+        <w:pStyle w:val="Normal"/>
+        <w:spacing w:lineRule="auto" w:line="360" w:before="0" w:after="120"/>
+        <w:ind w:firstLine="709"/>
+        <w:jc w:val="both"/>
+        <w:rPr/>
+      </w:pPr>
+      <w:r>
+        <w:rPr>
+          <w:rFonts w:eastAsia="Arial" w:cs="Arial"/>
+          <w:sz w:val="24"/>
+          <w:szCs w:val="24"/>
+        </w:rPr>
+        <w:t xml:space="preserve">O código-fonte, a especificação técnica e os diagramas do projeto permanecem disponíveis para consulta e continuidade no repositório </w:t>
+      </w:r>
+      <w:hyperlink r:id="rId10">
+        <w:r>
+          <w:rPr>
+            <w:rStyle w:val="ListLabel10"/>
+            <w:rFonts w:eastAsia="Arial" w:cs="Arial"/>
+            <w:sz w:val="24"/>
+            <w:szCs w:val="24"/>
+          </w:rPr>
+          <w:t>https://github.com/Jayzmatos22/GerenciadorDeEventos</w:t>
+        </w:r>
+      </w:hyperlink>
+      <w:r>
+        <w:rPr>
+          <w:rFonts w:eastAsia="Arial" w:cs="Arial"/>
+          <w:sz w:val="24"/>
+          <w:szCs w:val="24"/>
+        </w:rPr>
+        <w:t>.</w:t>
       </w:r>
       <w:r>
         <w:br w:type="page"/>
@@ -6657,7 +6731,7 @@
         <w:jc w:val="center"/>
         <w:rPr/>
       </w:pPr>
-      <w:bookmarkStart w:id="30" w:name="__RefHeading___Toc560_4209293148"/>
+      <w:bookmarkStart w:id="30" w:name="__RefHeading___Toc570_2577897446"/>
       <w:bookmarkEnd w:id="30"/>
       <w:r>
         <w:rPr>
@@ -6815,7 +6889,7 @@
       </w:r>
     </w:p>
     <w:sectPr>
-      <w:headerReference w:type="default" r:id="rId8"/>
+      <w:headerReference w:type="default" r:id="rId11"/>
       <w:type w:val="nextPage"/>
       <w:pgSz w:w="11906" w:h="16838"/>
       <w:pgMar w:left="1701" w:right="1134" w:gutter="0" w:header="1134" w:top="1701" w:footer="0" w:bottom="1134"/>

</xml_diff>

<commit_message>
docs: RA dos integrantes na capa e na folha de rosto do Projeto Integrador
Co-Authored-By: Claude Opus 5.5 <noreply@anthropic.com>
Claude-Session: https://claude.ai/code/session_011SKCdnRmci1yJCi4ZvMpS2
</commit_message>
<xml_diff>
--- a/docs/Projeto-Integrador.docx
+++ b/docs/Projeto-Integrador.docx
@@ -99,7 +99,7 @@
           <w:sz w:val="24"/>
           <w:szCs w:val="24"/>
         </w:rPr>
-        <w:t>BIANCA GOMES DANTAS DE ALMEIDA</w:t>
+        <w:t>BIANCA GOMES DANTAS DE ALMEIDA — RA 5665248</w:t>
       </w:r>
     </w:p>
     <w:p>
@@ -115,7 +115,7 @@
           <w:sz w:val="24"/>
           <w:szCs w:val="24"/>
         </w:rPr>
-        <w:t>GIOVANNA GOMES SILVA</w:t>
+        <w:t>GIOVANNA GOMES SILVA — RA 5565791</w:t>
       </w:r>
     </w:p>
     <w:p>
@@ -131,7 +131,7 @@
           <w:sz w:val="24"/>
           <w:szCs w:val="24"/>
         </w:rPr>
-        <w:t>JAILTON SANTOS DE MATOS</w:t>
+        <w:t>JAILTON SANTOS DE MATOS — RA 5773083</w:t>
       </w:r>
     </w:p>
     <w:p>
@@ -147,7 +147,7 @@
           <w:sz w:val="24"/>
           <w:szCs w:val="24"/>
         </w:rPr>
-        <w:t>LUCAS ALVES DE SOUZA</w:t>
+        <w:t>LUCAS ALVES DE SOUZA — RA 5740304</w:t>
       </w:r>
     </w:p>
     <w:p>
@@ -163,7 +163,7 @@
           <w:sz w:val="24"/>
           <w:szCs w:val="24"/>
         </w:rPr>
-        <w:t>LUCAS NEVES DOS SANTOS</w:t>
+        <w:t>LUCAS NEVES DOS SANTOS — RA 5718422</w:t>
       </w:r>
     </w:p>
     <w:p>
@@ -254,7 +254,7 @@
           <w:sz w:val="24"/>
           <w:szCs w:val="24"/>
         </w:rPr>
-        <w:t>BIANCA GOMES DANTAS DE ALMEIDA</w:t>
+        <w:t>BIANCA GOMES DANTAS DE ALMEIDA — RA 5665248</w:t>
       </w:r>
     </w:p>
     <w:p>
@@ -270,7 +270,7 @@
           <w:sz w:val="24"/>
           <w:szCs w:val="24"/>
         </w:rPr>
-        <w:t>GIOVANNA GOMES SILVA</w:t>
+        <w:t>GIOVANNA GOMES SILVA — RA 5565791</w:t>
       </w:r>
     </w:p>
     <w:p>
@@ -286,7 +286,7 @@
           <w:sz w:val="24"/>
           <w:szCs w:val="24"/>
         </w:rPr>
-        <w:t>JAILTON SANTOS DE MATOS</w:t>
+        <w:t>JAILTON SANTOS DE MATOS — RA 5773083</w:t>
       </w:r>
     </w:p>
     <w:p>
@@ -302,7 +302,7 @@
           <w:sz w:val="24"/>
           <w:szCs w:val="24"/>
         </w:rPr>
-        <w:t>LUCAS ALVES DE SOUZA</w:t>
+        <w:t>LUCAS ALVES DE SOUZA — RA 5740304</w:t>
       </w:r>
     </w:p>
     <w:p>
@@ -318,7 +318,7 @@
           <w:sz w:val="24"/>
           <w:szCs w:val="24"/>
         </w:rPr>
-        <w:t>LUCAS NEVES DOS SANTOS</w:t>
+        <w:t>LUCAS NEVES DOS SANTOS — RA 5718422</w:t>
       </w:r>
     </w:p>
     <w:p>
@@ -602,7 +602,7 @@
             </w:rPr>
             <w:fldChar w:fldCharType="separate"/>
           </w:r>
-          <w:hyperlink w:anchor="__RefHeading___Toc510_2577897446">
+          <w:hyperlink w:anchor="__RefHeading___Toc510_374617059">
             <w:r>
               <w:rPr>
                 <w:webHidden/>
@@ -623,7 +623,7 @@
             </w:tabs>
             <w:rPr/>
           </w:pPr>
-          <w:hyperlink w:anchor="__RefHeading___Toc512_2577897446">
+          <w:hyperlink w:anchor="__RefHeading___Toc512_374617059">
             <w:r>
               <w:rPr>
                 <w:webHidden/>
@@ -644,7 +644,7 @@
             </w:tabs>
             <w:rPr/>
           </w:pPr>
-          <w:hyperlink w:anchor="__RefHeading___Toc514_2577897446">
+          <w:hyperlink w:anchor="__RefHeading___Toc514_374617059">
             <w:r>
               <w:rPr>
                 <w:webHidden/>
@@ -665,7 +665,7 @@
             </w:tabs>
             <w:rPr/>
           </w:pPr>
-          <w:hyperlink w:anchor="__RefHeading___Toc516_2577897446">
+          <w:hyperlink w:anchor="__RefHeading___Toc516_374617059">
             <w:r>
               <w:rPr>
                 <w:webHidden/>
@@ -686,7 +686,7 @@
             </w:tabs>
             <w:rPr/>
           </w:pPr>
-          <w:hyperlink w:anchor="__RefHeading___Toc518_2577897446">
+          <w:hyperlink w:anchor="__RefHeading___Toc518_374617059">
             <w:r>
               <w:rPr>
                 <w:webHidden/>
@@ -714,7 +714,7 @@
             </w:tabs>
             <w:rPr/>
           </w:pPr>
-          <w:hyperlink w:anchor="__RefHeading___Toc520_2577897446">
+          <w:hyperlink w:anchor="__RefHeading___Toc520_374617059">
             <w:r>
               <w:rPr>
                 <w:webHidden/>
@@ -742,7 +742,7 @@
             </w:tabs>
             <w:rPr/>
           </w:pPr>
-          <w:hyperlink w:anchor="__RefHeading___Toc522_2577897446">
+          <w:hyperlink w:anchor="__RefHeading___Toc522_374617059">
             <w:r>
               <w:rPr>
                 <w:webHidden/>
@@ -763,7 +763,7 @@
             </w:tabs>
             <w:rPr/>
           </w:pPr>
-          <w:hyperlink w:anchor="__RefHeading___Toc524_2577897446">
+          <w:hyperlink w:anchor="__RefHeading___Toc524_374617059">
             <w:r>
               <w:rPr>
                 <w:webHidden/>
@@ -784,7 +784,7 @@
             </w:tabs>
             <w:rPr/>
           </w:pPr>
-          <w:hyperlink w:anchor="__RefHeading___Toc526_2577897446">
+          <w:hyperlink w:anchor="__RefHeading___Toc526_374617059">
             <w:r>
               <w:rPr>
                 <w:webHidden/>
@@ -805,7 +805,7 @@
             </w:tabs>
             <w:rPr/>
           </w:pPr>
-          <w:hyperlink w:anchor="__RefHeading___Toc528_2577897446">
+          <w:hyperlink w:anchor="__RefHeading___Toc528_374617059">
             <w:r>
               <w:rPr>
                 <w:webHidden/>
@@ -826,7 +826,7 @@
             </w:tabs>
             <w:rPr/>
           </w:pPr>
-          <w:hyperlink w:anchor="__RefHeading___Toc530_2577897446">
+          <w:hyperlink w:anchor="__RefHeading___Toc530_374617059">
             <w:r>
               <w:rPr>
                 <w:webHidden/>
@@ -847,7 +847,7 @@
             </w:tabs>
             <w:rPr/>
           </w:pPr>
-          <w:hyperlink w:anchor="__RefHeading___Toc532_2577897446">
+          <w:hyperlink w:anchor="__RefHeading___Toc532_374617059">
             <w:r>
               <w:rPr>
                 <w:webHidden/>
@@ -868,7 +868,7 @@
             </w:tabs>
             <w:rPr/>
           </w:pPr>
-          <w:hyperlink w:anchor="__RefHeading___Toc534_2577897446">
+          <w:hyperlink w:anchor="__RefHeading___Toc534_374617059">
             <w:r>
               <w:rPr>
                 <w:webHidden/>
@@ -889,7 +889,7 @@
             </w:tabs>
             <w:rPr/>
           </w:pPr>
-          <w:hyperlink w:anchor="__RefHeading___Toc536_2577897446">
+          <w:hyperlink w:anchor="__RefHeading___Toc536_374617059">
             <w:r>
               <w:rPr>
                 <w:webHidden/>
@@ -910,7 +910,7 @@
             </w:tabs>
             <w:rPr/>
           </w:pPr>
-          <w:hyperlink w:anchor="__RefHeading___Toc538_2577897446">
+          <w:hyperlink w:anchor="__RefHeading___Toc538_374617059">
             <w:r>
               <w:rPr>
                 <w:webHidden/>
@@ -931,7 +931,7 @@
             </w:tabs>
             <w:rPr/>
           </w:pPr>
-          <w:hyperlink w:anchor="__RefHeading___Toc540_2577897446">
+          <w:hyperlink w:anchor="__RefHeading___Toc540_374617059">
             <w:r>
               <w:rPr>
                 <w:webHidden/>
@@ -952,7 +952,7 @@
             </w:tabs>
             <w:rPr/>
           </w:pPr>
-          <w:hyperlink w:anchor="__RefHeading___Toc542_2577897446">
+          <w:hyperlink w:anchor="__RefHeading___Toc542_374617059">
             <w:r>
               <w:rPr>
                 <w:webHidden/>
@@ -973,7 +973,7 @@
             </w:tabs>
             <w:rPr/>
           </w:pPr>
-          <w:hyperlink w:anchor="__RefHeading___Toc544_2577897446">
+          <w:hyperlink w:anchor="__RefHeading___Toc544_374617059">
             <w:r>
               <w:rPr>
                 <w:webHidden/>
@@ -994,7 +994,7 @@
             </w:tabs>
             <w:rPr/>
           </w:pPr>
-          <w:hyperlink w:anchor="__RefHeading___Toc546_2577897446">
+          <w:hyperlink w:anchor="__RefHeading___Toc546_374617059">
             <w:r>
               <w:rPr>
                 <w:webHidden/>
@@ -1015,7 +1015,7 @@
             </w:tabs>
             <w:rPr/>
           </w:pPr>
-          <w:hyperlink w:anchor="__RefHeading___Toc548_2577897446">
+          <w:hyperlink w:anchor="__RefHeading___Toc548_374617059">
             <w:r>
               <w:rPr>
                 <w:webHidden/>
@@ -1036,7 +1036,7 @@
             </w:tabs>
             <w:rPr/>
           </w:pPr>
-          <w:hyperlink w:anchor="__RefHeading___Toc550_2577897446">
+          <w:hyperlink w:anchor="__RefHeading___Toc550_374617059">
             <w:r>
               <w:rPr>
                 <w:webHidden/>
@@ -1057,7 +1057,7 @@
             </w:tabs>
             <w:rPr/>
           </w:pPr>
-          <w:hyperlink w:anchor="__RefHeading___Toc552_2577897446">
+          <w:hyperlink w:anchor="__RefHeading___Toc552_374617059">
             <w:r>
               <w:rPr>
                 <w:webHidden/>
@@ -1078,7 +1078,7 @@
             </w:tabs>
             <w:rPr/>
           </w:pPr>
-          <w:hyperlink w:anchor="__RefHeading___Toc554_2577897446">
+          <w:hyperlink w:anchor="__RefHeading___Toc554_374617059">
             <w:r>
               <w:rPr>
                 <w:webHidden/>
@@ -1099,7 +1099,7 @@
             </w:tabs>
             <w:rPr/>
           </w:pPr>
-          <w:hyperlink w:anchor="__RefHeading___Toc556_2577897446">
+          <w:hyperlink w:anchor="__RefHeading___Toc556_374617059">
             <w:r>
               <w:rPr>
                 <w:webHidden/>
@@ -1120,7 +1120,7 @@
             </w:tabs>
             <w:rPr/>
           </w:pPr>
-          <w:hyperlink w:anchor="__RefHeading___Toc558_2577897446">
+          <w:hyperlink w:anchor="__RefHeading___Toc558_374617059">
             <w:r>
               <w:rPr>
                 <w:webHidden/>
@@ -1141,7 +1141,7 @@
             </w:tabs>
             <w:rPr/>
           </w:pPr>
-          <w:hyperlink w:anchor="__RefHeading___Toc560_2577897446">
+          <w:hyperlink w:anchor="__RefHeading___Toc560_374617059">
             <w:r>
               <w:rPr>
                 <w:webHidden/>
@@ -1162,7 +1162,7 @@
             </w:tabs>
             <w:rPr/>
           </w:pPr>
-          <w:hyperlink w:anchor="__RefHeading___Toc562_2577897446">
+          <w:hyperlink w:anchor="__RefHeading___Toc562_374617059">
             <w:r>
               <w:rPr>
                 <w:webHidden/>
@@ -1183,7 +1183,7 @@
             </w:tabs>
             <w:rPr/>
           </w:pPr>
-          <w:hyperlink w:anchor="__RefHeading___Toc564_2577897446">
+          <w:hyperlink w:anchor="__RefHeading___Toc564_374617059">
             <w:r>
               <w:rPr>
                 <w:webHidden/>
@@ -1204,7 +1204,7 @@
             </w:tabs>
             <w:rPr/>
           </w:pPr>
-          <w:hyperlink w:anchor="__RefHeading___Toc566_2577897446">
+          <w:hyperlink w:anchor="__RefHeading___Toc566_374617059">
             <w:r>
               <w:rPr>
                 <w:webHidden/>
@@ -1225,7 +1225,7 @@
             </w:tabs>
             <w:rPr/>
           </w:pPr>
-          <w:hyperlink w:anchor="__RefHeading___Toc568_2577897446">
+          <w:hyperlink w:anchor="__RefHeading___Toc568_374617059">
             <w:r>
               <w:rPr>
                 <w:webHidden/>
@@ -1246,7 +1246,7 @@
             </w:tabs>
             <w:rPr/>
           </w:pPr>
-          <w:hyperlink w:anchor="__RefHeading___Toc570_2577897446">
+          <w:hyperlink w:anchor="__RefHeading___Toc570_374617059">
             <w:r>
               <w:rPr>
                 <w:webHidden/>
@@ -1287,7 +1287,7 @@
         <w:jc w:val="left"/>
         <w:rPr/>
       </w:pPr>
-      <w:bookmarkStart w:id="0" w:name="__RefHeading___Toc510_2577897446"/>
+      <w:bookmarkStart w:id="0" w:name="__RefHeading___Toc510_374617059"/>
       <w:bookmarkEnd w:id="0"/>
       <w:r>
         <w:rPr>
@@ -1378,7 +1378,7 @@
         <w:jc w:val="left"/>
         <w:rPr/>
       </w:pPr>
-      <w:bookmarkStart w:id="1" w:name="__RefHeading___Toc512_2577897446"/>
+      <w:bookmarkStart w:id="1" w:name="__RefHeading___Toc512_374617059"/>
       <w:bookmarkEnd w:id="1"/>
       <w:r>
         <w:rPr>
@@ -1433,7 +1433,7 @@
         <w:jc w:val="left"/>
         <w:rPr/>
       </w:pPr>
-      <w:bookmarkStart w:id="2" w:name="__RefHeading___Toc514_2577897446"/>
+      <w:bookmarkStart w:id="2" w:name="__RefHeading___Toc514_374617059"/>
       <w:bookmarkEnd w:id="2"/>
       <w:r>
         <w:rPr>
@@ -1471,7 +1471,7 @@
         <w:jc w:val="left"/>
         <w:rPr/>
       </w:pPr>
-      <w:bookmarkStart w:id="3" w:name="__RefHeading___Toc516_2577897446"/>
+      <w:bookmarkStart w:id="3" w:name="__RefHeading___Toc516_374617059"/>
       <w:bookmarkEnd w:id="3"/>
       <w:r>
         <w:rPr>
@@ -1492,7 +1492,7 @@
         <w:jc w:val="left"/>
         <w:rPr/>
       </w:pPr>
-      <w:bookmarkStart w:id="4" w:name="__RefHeading___Toc518_2577897446"/>
+      <w:bookmarkStart w:id="4" w:name="__RefHeading___Toc518_374617059"/>
       <w:bookmarkEnd w:id="4"/>
       <w:r>
         <w:rPr>
@@ -1532,7 +1532,7 @@
         <w:jc w:val="left"/>
         <w:rPr/>
       </w:pPr>
-      <w:bookmarkStart w:id="5" w:name="__RefHeading___Toc520_2577897446"/>
+      <w:bookmarkStart w:id="5" w:name="__RefHeading___Toc520_374617059"/>
       <w:bookmarkEnd w:id="5"/>
       <w:r>
         <w:rPr>
@@ -1674,7 +1674,7 @@
         <w:jc w:val="left"/>
         <w:rPr/>
       </w:pPr>
-      <w:bookmarkStart w:id="6" w:name="__RefHeading___Toc522_2577897446"/>
+      <w:bookmarkStart w:id="6" w:name="__RefHeading___Toc522_374617059"/>
       <w:bookmarkEnd w:id="6"/>
       <w:r>
         <w:rPr>
@@ -1732,7 +1732,7 @@
         <w:jc w:val="left"/>
         <w:rPr/>
       </w:pPr>
-      <w:bookmarkStart w:id="7" w:name="__RefHeading___Toc524_2577897446"/>
+      <w:bookmarkStart w:id="7" w:name="__RefHeading___Toc524_374617059"/>
       <w:bookmarkEnd w:id="7"/>
       <w:r>
         <w:rPr>
@@ -1770,7 +1770,7 @@
         <w:jc w:val="left"/>
         <w:rPr/>
       </w:pPr>
-      <w:bookmarkStart w:id="8" w:name="__RefHeading___Toc526_2577897446"/>
+      <w:bookmarkStart w:id="8" w:name="__RefHeading___Toc526_374617059"/>
       <w:bookmarkEnd w:id="8"/>
       <w:r>
         <w:rPr>
@@ -1825,7 +1825,7 @@
         <w:jc w:val="left"/>
         <w:rPr/>
       </w:pPr>
-      <w:bookmarkStart w:id="9" w:name="__RefHeading___Toc528_2577897446"/>
+      <w:bookmarkStart w:id="9" w:name="__RefHeading___Toc528_374617059"/>
       <w:bookmarkEnd w:id="9"/>
       <w:r>
         <w:rPr>
@@ -1863,7 +1863,7 @@
         <w:jc w:val="left"/>
         <w:rPr/>
       </w:pPr>
-      <w:bookmarkStart w:id="10" w:name="__RefHeading___Toc530_2577897446"/>
+      <w:bookmarkStart w:id="10" w:name="__RefHeading___Toc530_374617059"/>
       <w:bookmarkEnd w:id="10"/>
       <w:r>
         <w:rPr>
@@ -1901,7 +1901,7 @@
         <w:jc w:val="left"/>
         <w:rPr/>
       </w:pPr>
-      <w:bookmarkStart w:id="11" w:name="__RefHeading___Toc532_2577897446"/>
+      <w:bookmarkStart w:id="11" w:name="__RefHeading___Toc532_374617059"/>
       <w:bookmarkEnd w:id="11"/>
       <w:r>
         <w:rPr>
@@ -1939,7 +1939,7 @@
         <w:jc w:val="left"/>
         <w:rPr/>
       </w:pPr>
-      <w:bookmarkStart w:id="12" w:name="__RefHeading___Toc534_2577897446"/>
+      <w:bookmarkStart w:id="12" w:name="__RefHeading___Toc534_374617059"/>
       <w:bookmarkEnd w:id="12"/>
       <w:r>
         <w:rPr>
@@ -1997,7 +1997,7 @@
         <w:jc w:val="left"/>
         <w:rPr/>
       </w:pPr>
-      <w:bookmarkStart w:id="13" w:name="__RefHeading___Toc536_2577897446"/>
+      <w:bookmarkStart w:id="13" w:name="__RefHeading___Toc536_374617059"/>
       <w:bookmarkEnd w:id="13"/>
       <w:r>
         <w:rPr>
@@ -2018,7 +2018,7 @@
         <w:jc w:val="left"/>
         <w:rPr/>
       </w:pPr>
-      <w:bookmarkStart w:id="14" w:name="__RefHeading___Toc538_2577897446"/>
+      <w:bookmarkStart w:id="14" w:name="__RefHeading___Toc538_374617059"/>
       <w:bookmarkEnd w:id="14"/>
       <w:r>
         <w:rPr>
@@ -2056,7 +2056,7 @@
         <w:jc w:val="left"/>
         <w:rPr/>
       </w:pPr>
-      <w:bookmarkStart w:id="15" w:name="__RefHeading___Toc540_2577897446"/>
+      <w:bookmarkStart w:id="15" w:name="__RefHeading___Toc540_374617059"/>
       <w:bookmarkEnd w:id="15"/>
       <w:r>
         <w:rPr>
@@ -3190,7 +3190,7 @@
         <w:jc w:val="left"/>
         <w:rPr/>
       </w:pPr>
-      <w:bookmarkStart w:id="16" w:name="__RefHeading___Toc542_2577897446"/>
+      <w:bookmarkStart w:id="16" w:name="__RefHeading___Toc542_374617059"/>
       <w:bookmarkEnd w:id="16"/>
       <w:r>
         <w:rPr>
@@ -3756,7 +3756,7 @@
         <w:jc w:val="left"/>
         <w:rPr/>
       </w:pPr>
-      <w:bookmarkStart w:id="17" w:name="__RefHeading___Toc544_2577897446"/>
+      <w:bookmarkStart w:id="17" w:name="__RefHeading___Toc544_374617059"/>
       <w:bookmarkEnd w:id="17"/>
       <w:r>
         <w:rPr>
@@ -3811,7 +3811,7 @@
         <w:jc w:val="left"/>
         <w:rPr/>
       </w:pPr>
-      <w:bookmarkStart w:id="18" w:name="__RefHeading___Toc546_2577897446"/>
+      <w:bookmarkStart w:id="18" w:name="__RefHeading___Toc546_374617059"/>
       <w:bookmarkEnd w:id="18"/>
       <w:r>
         <w:rPr>
@@ -3905,7 +3905,7 @@
         <w:jc w:val="left"/>
         <w:rPr/>
       </w:pPr>
-      <w:bookmarkStart w:id="19" w:name="__RefHeading___Toc548_2577897446"/>
+      <w:bookmarkStart w:id="19" w:name="__RefHeading___Toc548_374617059"/>
       <w:bookmarkEnd w:id="19"/>
       <w:r>
         <w:rPr>
@@ -3926,7 +3926,7 @@
         <w:jc w:val="left"/>
         <w:rPr/>
       </w:pPr>
-      <w:bookmarkStart w:id="20" w:name="__RefHeading___Toc550_2577897446"/>
+      <w:bookmarkStart w:id="20" w:name="__RefHeading___Toc550_374617059"/>
       <w:bookmarkEnd w:id="20"/>
       <w:r>
         <w:rPr>
@@ -5849,7 +5849,7 @@
         <w:jc w:val="left"/>
         <w:rPr/>
       </w:pPr>
-      <w:bookmarkStart w:id="21" w:name="__RefHeading___Toc552_2577897446"/>
+      <w:bookmarkStart w:id="21" w:name="__RefHeading___Toc552_374617059"/>
       <w:bookmarkEnd w:id="21"/>
       <w:r>
         <w:rPr>
@@ -5986,7 +5986,7 @@
         <w:jc w:val="left"/>
         <w:rPr/>
       </w:pPr>
-      <w:bookmarkStart w:id="22" w:name="__RefHeading___Toc554_2577897446"/>
+      <w:bookmarkStart w:id="22" w:name="__RefHeading___Toc554_374617059"/>
       <w:bookmarkEnd w:id="22"/>
       <w:r>
         <w:rPr>
@@ -6041,7 +6041,7 @@
         <w:jc w:val="left"/>
         <w:rPr/>
       </w:pPr>
-      <w:bookmarkStart w:id="23" w:name="__RefHeading___Toc556_2577897446"/>
+      <w:bookmarkStart w:id="23" w:name="__RefHeading___Toc556_374617059"/>
       <w:bookmarkEnd w:id="23"/>
       <w:r>
         <w:rPr>
@@ -6096,7 +6096,7 @@
         <w:jc w:val="left"/>
         <w:rPr/>
       </w:pPr>
-      <w:bookmarkStart w:id="24" w:name="__RefHeading___Toc558_2577897446"/>
+      <w:bookmarkStart w:id="24" w:name="__RefHeading___Toc558_374617059"/>
       <w:bookmarkEnd w:id="24"/>
       <w:r>
         <w:rPr>
@@ -6250,7 +6250,7 @@
         <w:jc w:val="left"/>
         <w:rPr/>
       </w:pPr>
-      <w:bookmarkStart w:id="25" w:name="__RefHeading___Toc560_2577897446"/>
+      <w:bookmarkStart w:id="25" w:name="__RefHeading___Toc560_374617059"/>
       <w:bookmarkEnd w:id="25"/>
       <w:r>
         <w:rPr>
@@ -6305,7 +6305,7 @@
         <w:jc w:val="left"/>
         <w:rPr/>
       </w:pPr>
-      <w:bookmarkStart w:id="26" w:name="__RefHeading___Toc562_2577897446"/>
+      <w:bookmarkStart w:id="26" w:name="__RefHeading___Toc562_374617059"/>
       <w:bookmarkEnd w:id="26"/>
       <w:r>
         <w:rPr>
@@ -6473,7 +6473,7 @@
         <w:jc w:val="left"/>
         <w:rPr/>
       </w:pPr>
-      <w:bookmarkStart w:id="27" w:name="__RefHeading___Toc564_2577897446"/>
+      <w:bookmarkStart w:id="27" w:name="__RefHeading___Toc564_374617059"/>
       <w:bookmarkEnd w:id="27"/>
       <w:r>
         <w:rPr>
@@ -6545,7 +6545,7 @@
         <w:jc w:val="left"/>
         <w:rPr/>
       </w:pPr>
-      <w:bookmarkStart w:id="28" w:name="__RefHeading___Toc566_2577897446"/>
+      <w:bookmarkStart w:id="28" w:name="__RefHeading___Toc566_374617059"/>
       <w:bookmarkEnd w:id="28"/>
       <w:r>
         <w:rPr>
@@ -6603,7 +6603,7 @@
         <w:jc w:val="left"/>
         <w:rPr/>
       </w:pPr>
-      <w:bookmarkStart w:id="29" w:name="__RefHeading___Toc568_2577897446"/>
+      <w:bookmarkStart w:id="29" w:name="__RefHeading___Toc568_374617059"/>
       <w:bookmarkEnd w:id="29"/>
       <w:r>
         <w:rPr>
@@ -6731,7 +6731,7 @@
         <w:jc w:val="center"/>
         <w:rPr/>
       </w:pPr>
-      <w:bookmarkStart w:id="30" w:name="__RefHeading___Toc570_2577897446"/>
+      <w:bookmarkStart w:id="30" w:name="__RefHeading___Toc570_374617059"/>
       <w:bookmarkEnd w:id="30"/>
       <w:r>
         <w:rPr>

</xml_diff>